<commit_message>
#227 Errores de compra corregidos.
</commit_message>
<xml_diff>
--- a/test/AppForSEII2526.UIT/CU_ComprarHerramientas/TC-ComprarHerramientas_UIT.docx
+++ b/test/AppForSEII2526.UIT/CU_ComprarHerramientas/TC-ComprarHerramientas_UIT.docx
@@ -79,21 +79,12 @@
           <w:lang w:val="es-ES"/>
         </w:rPr>
       </w:pPr>
-      <w:proofErr w:type="spellStart"/>
       <w:r>
         <w:rPr>
           <w:sz w:val="28"/>
           <w:lang w:val="es-ES"/>
         </w:rPr>
-        <w:t>Version</w:t>
-      </w:r>
-      <w:proofErr w:type="spellEnd"/>
-      <w:r>
-        <w:rPr>
-          <w:sz w:val="28"/>
-          <w:lang w:val="es-ES"/>
-        </w:rPr>
-        <w:t xml:space="preserve"> &lt;1.0&gt;</w:t>
+        <w:t>Version &lt;1.0&gt;</w:t>
       </w:r>
     </w:p>
     <w:p>
@@ -1208,13 +1199,8 @@
         <w:t>Casos</w:t>
       </w:r>
       <w:r>
-        <w:t xml:space="preserve"> de </w:t>
-      </w:r>
-      <w:proofErr w:type="spellStart"/>
-      <w:r>
-        <w:t>Pruebas</w:t>
-      </w:r>
-      <w:proofErr w:type="spellEnd"/>
+        <w:t xml:space="preserve"> de Pruebas</w:t>
+      </w:r>
       <w:r>
         <w:fldChar w:fldCharType="end"/>
       </w:r>
@@ -1278,19 +1264,15 @@
       <w:r>
         <w:t>/</w:t>
       </w:r>
-      <w:proofErr w:type="spellStart"/>
       <w:r>
         <w:t>Compra</w:t>
       </w:r>
-      <w:proofErr w:type="spellEnd"/>
       <w:r>
         <w:t>/</w:t>
       </w:r>
-      <w:proofErr w:type="spellStart"/>
       <w:r>
         <w:t>CompraCreate</w:t>
       </w:r>
-      <w:proofErr w:type="spellEnd"/>
     </w:p>
     <w:p>
       <w:pPr>
@@ -1306,22 +1288,18 @@
       <w:r>
         <w:t>/</w:t>
       </w:r>
-      <w:proofErr w:type="spellStart"/>
       <w:r>
         <w:t>Compra</w:t>
       </w:r>
-      <w:proofErr w:type="spellEnd"/>
       <w:r>
         <w:t xml:space="preserve"> </w:t>
       </w:r>
       <w:r>
         <w:t>/</w:t>
       </w:r>
-      <w:proofErr w:type="spellStart"/>
       <w:r>
         <w:t>CompraDetails</w:t>
       </w:r>
-      <w:proofErr w:type="spellEnd"/>
     </w:p>
     <w:p>
       <w:pPr>
@@ -1337,22 +1315,18 @@
       <w:r>
         <w:t>/</w:t>
       </w:r>
-      <w:proofErr w:type="spellStart"/>
       <w:r>
         <w:t>Compra</w:t>
       </w:r>
-      <w:proofErr w:type="spellEnd"/>
       <w:r>
         <w:t xml:space="preserve"> </w:t>
       </w:r>
       <w:r>
         <w:t>/</w:t>
       </w:r>
-      <w:proofErr w:type="spellStart"/>
       <w:r>
         <w:t>SelectHerramientaForCompra</w:t>
       </w:r>
-      <w:proofErr w:type="spellEnd"/>
     </w:p>
     <w:p>
       <w:pPr>
@@ -1852,8 +1826,8 @@
       <w:tblGrid>
         <w:gridCol w:w="1058"/>
         <w:gridCol w:w="2177"/>
-        <w:gridCol w:w="2245"/>
-        <w:gridCol w:w="1818"/>
+        <w:gridCol w:w="2577"/>
+        <w:gridCol w:w="1486"/>
         <w:gridCol w:w="850"/>
         <w:gridCol w:w="2797"/>
         <w:gridCol w:w="2522"/>
@@ -1918,7 +1892,7 @@
         </w:tc>
         <w:tc>
           <w:tcPr>
-            <w:tcW w:w="2215" w:type="dxa"/>
+            <w:tcW w:w="2547" w:type="dxa"/>
             <w:shd w:val="clear" w:color="auto" w:fill="BFBFBF" w:themeFill="background1" w:themeFillShade="BF"/>
             <w:vAlign w:val="center"/>
             <w:hideMark/>
@@ -2016,7 +1990,7 @@
         </w:tc>
         <w:tc>
           <w:tcPr>
-            <w:tcW w:w="1788" w:type="dxa"/>
+            <w:tcW w:w="1456" w:type="dxa"/>
             <w:shd w:val="clear" w:color="auto" w:fill="BFBFBF" w:themeFill="background1" w:themeFillShade="BF"/>
             <w:vAlign w:val="center"/>
             <w:hideMark/>
@@ -2112,25 +2086,7 @@
                 <w:bCs/>
                 <w:lang w:val="es-ES"/>
               </w:rPr>
-              <w:t xml:space="preserve">Nombre, Apellidos, dirección, </w:t>
-            </w:r>
-            <w:proofErr w:type="spellStart"/>
-            <w:r>
-              <w:rPr>
-                <w:b/>
-                <w:bCs/>
-                <w:lang w:val="es-ES"/>
-              </w:rPr>
-              <w:t>métodoPago</w:t>
-            </w:r>
-            <w:proofErr w:type="spellEnd"/>
-            <w:r>
-              <w:rPr>
-                <w:b/>
-                <w:bCs/>
-                <w:lang w:val="es-ES"/>
-              </w:rPr>
-              <w:t>, cantidad, descripción</w:t>
+              <w:t>Nombre, Apellidos, dirección, métodoPago, cantidad, descripción</w:t>
             </w:r>
           </w:p>
         </w:tc>
@@ -2215,27 +2171,81 @@
         </w:tc>
         <w:tc>
           <w:tcPr>
-            <w:tcW w:w="2215" w:type="dxa"/>
-            <w:vAlign w:val="center"/>
-          </w:tcPr>
-          <w:p>
-            <w:pPr>
-              <w:jc w:val="left"/>
-              <w:rPr>
-                <w:lang w:val="es-ES"/>
-              </w:rPr>
-            </w:pPr>
-            <w:r>
-              <w:rPr>
-                <w:lang w:val="es-ES"/>
-              </w:rPr>
-              <w:t>4, “Alicates”, “Metal”, 25, “Sergio”</w:t>
-            </w:r>
-          </w:p>
-        </w:tc>
-        <w:tc>
-          <w:tcPr>
-            <w:tcW w:w="1788" w:type="dxa"/>
+            <w:tcW w:w="2547" w:type="dxa"/>
+            <w:vAlign w:val="center"/>
+          </w:tcPr>
+          <w:p>
+            <w:pPr>
+              <w:jc w:val="left"/>
+              <w:rPr>
+                <w:lang w:val="es-ES"/>
+              </w:rPr>
+            </w:pPr>
+            <w:r>
+              <w:rPr>
+                <w:lang w:val="es-ES"/>
+              </w:rPr>
+              <w:t>2</w:t>
+            </w:r>
+            <w:r>
+              <w:rPr>
+                <w:lang w:val="es-ES"/>
+              </w:rPr>
+              <w:t>, “</w:t>
+            </w:r>
+            <w:r>
+              <w:rPr>
+                <w:lang w:val="es-ES"/>
+              </w:rPr>
+              <w:t>Martillo</w:t>
+            </w:r>
+            <w:r>
+              <w:rPr>
+                <w:lang w:val="es-ES"/>
+              </w:rPr>
+              <w:t>”, “</w:t>
+            </w:r>
+            <w:r>
+              <w:rPr>
+                <w:lang w:val="es-ES"/>
+              </w:rPr>
+              <w:t>Madera</w:t>
+            </w:r>
+            <w:r>
+              <w:rPr>
+                <w:lang w:val="es-ES"/>
+              </w:rPr>
+              <w:t>”, 2</w:t>
+            </w:r>
+            <w:r>
+              <w:rPr>
+                <w:lang w:val="es-ES"/>
+              </w:rPr>
+              <w:t>0</w:t>
+            </w:r>
+            <w:r>
+              <w:rPr>
+                <w:lang w:val="es-ES"/>
+              </w:rPr>
+              <w:t>, “</w:t>
+            </w:r>
+            <w:r>
+              <w:rPr>
+                <w:lang w:val="es-ES"/>
+              </w:rPr>
+              <w:t>Makita</w:t>
+            </w:r>
+            <w:r>
+              <w:rPr>
+                <w:lang w:val="es-ES"/>
+              </w:rPr>
+              <w:t>”</w:t>
+            </w:r>
+          </w:p>
+        </w:tc>
+        <w:tc>
+          <w:tcPr>
+            <w:tcW w:w="1456" w:type="dxa"/>
             <w:vAlign w:val="center"/>
           </w:tcPr>
           <w:p>
@@ -2309,16 +2319,8 @@
               <w:rPr>
                 <w:lang w:val="es-ES"/>
               </w:rPr>
-              <w:t xml:space="preserve">201 </w:t>
-            </w:r>
-            <w:proofErr w:type="spellStart"/>
-            <w:r>
-              <w:rPr>
-                <w:lang w:val="es-ES"/>
-              </w:rPr>
-              <w:t>Created</w:t>
-            </w:r>
-            <w:proofErr w:type="spellEnd"/>
+              <w:t>201 Created</w:t>
+            </w:r>
           </w:p>
         </w:tc>
       </w:tr>
@@ -2420,7 +2422,7 @@
         </w:tc>
         <w:tc>
           <w:tcPr>
-            <w:tcW w:w="2215" w:type="dxa"/>
+            <w:tcW w:w="2547" w:type="dxa"/>
             <w:vAlign w:val="center"/>
             <w:hideMark/>
           </w:tcPr>
@@ -2441,7 +2443,7 @@
         </w:tc>
         <w:tc>
           <w:tcPr>
-            <w:tcW w:w="1788" w:type="dxa"/>
+            <w:tcW w:w="1456" w:type="dxa"/>
             <w:vAlign w:val="center"/>
             <w:hideMark/>
           </w:tcPr>
@@ -2519,7 +2521,55 @@
               <w:rPr>
                 <w:lang w:val="es-ES"/>
               </w:rPr>
-              <w:t>Tabla de Herramientas: 3, “Astilla”, “Madera”, 7, “Pepe”</w:t>
+              <w:t xml:space="preserve">Tabla de Herramientas: </w:t>
+            </w:r>
+            <w:r>
+              <w:rPr>
+                <w:lang w:val="es-ES"/>
+              </w:rPr>
+              <w:t>2</w:t>
+            </w:r>
+            <w:r>
+              <w:rPr>
+                <w:lang w:val="es-ES"/>
+              </w:rPr>
+              <w:t>, “</w:t>
+            </w:r>
+            <w:r>
+              <w:rPr>
+                <w:lang w:val="es-ES"/>
+              </w:rPr>
+              <w:t>Martillo</w:t>
+            </w:r>
+            <w:r>
+              <w:rPr>
+                <w:lang w:val="es-ES"/>
+              </w:rPr>
+              <w:t xml:space="preserve">”, “Madera”, </w:t>
+            </w:r>
+            <w:r>
+              <w:rPr>
+                <w:lang w:val="es-ES"/>
+              </w:rPr>
+              <w:t>20</w:t>
+            </w:r>
+            <w:r>
+              <w:rPr>
+                <w:lang w:val="es-ES"/>
+              </w:rPr>
+              <w:t>, “</w:t>
+            </w:r>
+            <w:r>
+              <w:rPr>
+                <w:lang w:val="es-ES"/>
+              </w:rPr>
+              <w:t>Makita</w:t>
+            </w:r>
+            <w:r>
+              <w:rPr>
+                <w:lang w:val="es-ES"/>
+              </w:rPr>
+              <w:t>”</w:t>
             </w:r>
           </w:p>
         </w:tc>
@@ -2614,7 +2664,7 @@
         </w:tc>
         <w:tc>
           <w:tcPr>
-            <w:tcW w:w="2215" w:type="dxa"/>
+            <w:tcW w:w="2547" w:type="dxa"/>
             <w:vAlign w:val="center"/>
             <w:hideMark/>
           </w:tcPr>
@@ -2635,7 +2685,7 @@
         </w:tc>
         <w:tc>
           <w:tcPr>
-            <w:tcW w:w="1788" w:type="dxa"/>
+            <w:tcW w:w="1456" w:type="dxa"/>
             <w:vAlign w:val="center"/>
             <w:hideMark/>
           </w:tcPr>
@@ -2713,67 +2763,7 @@
               <w:rPr>
                 <w:lang w:val="es-ES"/>
               </w:rPr>
-              <w:t xml:space="preserve">Tabla de Herramientas: </w:t>
-            </w:r>
-            <w:r>
-              <w:rPr>
-                <w:lang w:val="es-ES"/>
-              </w:rPr>
-              <w:t>2</w:t>
-            </w:r>
-            <w:r>
-              <w:rPr>
-                <w:lang w:val="es-ES"/>
-              </w:rPr>
-              <w:t>, “</w:t>
-            </w:r>
-            <w:r>
-              <w:rPr>
-                <w:lang w:val="es-ES"/>
-              </w:rPr>
-              <w:t>Martillo</w:t>
-            </w:r>
-            <w:r>
-              <w:rPr>
-                <w:lang w:val="es-ES"/>
-              </w:rPr>
-              <w:t>”, “</w:t>
-            </w:r>
-            <w:r>
-              <w:rPr>
-                <w:lang w:val="es-ES"/>
-              </w:rPr>
-              <w:t>Acero</w:t>
-            </w:r>
-            <w:r>
-              <w:rPr>
-                <w:lang w:val="es-ES"/>
-              </w:rPr>
-              <w:t xml:space="preserve">”, </w:t>
-            </w:r>
-            <w:r>
-              <w:rPr>
-                <w:lang w:val="es-ES"/>
-              </w:rPr>
-              <w:t>20</w:t>
-            </w:r>
-            <w:r>
-              <w:rPr>
-                <w:lang w:val="es-ES"/>
-              </w:rPr>
-              <w:t>, “</w:t>
-            </w:r>
-            <w:r>
-              <w:rPr>
-                <w:lang w:val="es-ES"/>
-              </w:rPr>
-              <w:t>Antonio</w:t>
-            </w:r>
-            <w:r>
-              <w:rPr>
-                <w:lang w:val="es-ES"/>
-              </w:rPr>
-              <w:t>”</w:t>
+              <w:t>Tabla de Herramientas: 2, “Martillo”, “Madera”, 20, “Makita”</w:t>
             </w:r>
           </w:p>
         </w:tc>
@@ -2890,7 +2880,7 @@
         </w:tc>
         <w:tc>
           <w:tcPr>
-            <w:tcW w:w="2215" w:type="dxa"/>
+            <w:tcW w:w="2547" w:type="dxa"/>
             <w:vAlign w:val="center"/>
             <w:hideMark/>
           </w:tcPr>
@@ -2911,7 +2901,7 @@
         </w:tc>
         <w:tc>
           <w:tcPr>
-            <w:tcW w:w="1788" w:type="dxa"/>
+            <w:tcW w:w="1456" w:type="dxa"/>
             <w:vAlign w:val="center"/>
             <w:hideMark/>
           </w:tcPr>
@@ -2926,7 +2916,7 @@
               <w:rPr>
                 <w:lang w:val="es-ES"/>
               </w:rPr>
-              <w:t>Madera</w:t>
+              <w:t>Metal</w:t>
             </w:r>
           </w:p>
         </w:tc>
@@ -2947,7 +2937,7 @@
               <w:rPr>
                 <w:lang w:val="es-ES"/>
               </w:rPr>
-              <w:t>7</w:t>
+              <w:t>15</w:t>
             </w:r>
           </w:p>
         </w:tc>
@@ -2989,7 +2979,55 @@
               <w:rPr>
                 <w:lang w:val="es-ES"/>
               </w:rPr>
-              <w:t>Tabla de Herramientas: 3, “Astilla”, “Madera”, 7, “Pepe”</w:t>
+              <w:t>Tabla de Herramientas: 3, “</w:t>
+            </w:r>
+            <w:r>
+              <w:rPr>
+                <w:lang w:val="es-ES"/>
+              </w:rPr>
+              <w:t>Destornillador</w:t>
+            </w:r>
+            <w:r>
+              <w:rPr>
+                <w:lang w:val="es-ES"/>
+              </w:rPr>
+              <w:t>”, “</w:t>
+            </w:r>
+            <w:r>
+              <w:rPr>
+                <w:lang w:val="es-ES"/>
+              </w:rPr>
+              <w:t>Metal</w:t>
+            </w:r>
+            <w:r>
+              <w:rPr>
+                <w:lang w:val="es-ES"/>
+              </w:rPr>
+              <w:t xml:space="preserve">”, </w:t>
+            </w:r>
+            <w:r>
+              <w:rPr>
+                <w:lang w:val="es-ES"/>
+              </w:rPr>
+              <w:t>15</w:t>
+            </w:r>
+            <w:r>
+              <w:rPr>
+                <w:lang w:val="es-ES"/>
+              </w:rPr>
+              <w:t>, “</w:t>
+            </w:r>
+            <w:r>
+              <w:rPr>
+                <w:lang w:val="es-ES"/>
+              </w:rPr>
+              <w:t>Bosch</w:t>
+            </w:r>
+            <w:r>
+              <w:rPr>
+                <w:lang w:val="es-ES"/>
+              </w:rPr>
+              <w:t>”</w:t>
             </w:r>
           </w:p>
         </w:tc>
@@ -3082,7 +3120,7 @@
         </w:tc>
         <w:tc>
           <w:tcPr>
-            <w:tcW w:w="2215" w:type="dxa"/>
+            <w:tcW w:w="2547" w:type="dxa"/>
             <w:vAlign w:val="center"/>
             <w:hideMark/>
           </w:tcPr>
@@ -3097,13 +3135,13 @@
               <w:rPr>
                 <w:lang w:val="es-ES"/>
               </w:rPr>
-              <w:t>4, “Alicates”, “Metal”, 25, “Sergio”</w:t>
-            </w:r>
-          </w:p>
-        </w:tc>
-        <w:tc>
-          <w:tcPr>
-            <w:tcW w:w="1788" w:type="dxa"/>
+              <w:t>2, “Martillo”, “Madera”, 20, “Makita”</w:t>
+            </w:r>
+          </w:p>
+        </w:tc>
+        <w:tc>
+          <w:tcPr>
+            <w:tcW w:w="1456" w:type="dxa"/>
             <w:vAlign w:val="center"/>
             <w:hideMark/>
           </w:tcPr>
@@ -3172,7 +3210,7 @@
               <w:rPr>
                 <w:lang w:val="es-ES"/>
               </w:rPr>
-              <w:t xml:space="preserve"> Eliminar “Astilla”</w:t>
+              <w:t xml:space="preserve"> Eliminar “Destornillador”</w:t>
             </w:r>
           </w:p>
         </w:tc>
@@ -3310,21 +3348,13 @@
                 <w:iCs/>
                 <w:lang w:val="es-ES"/>
               </w:rPr>
-              <w:t>No hay datos</w:t>
-            </w:r>
-            <w:r>
-              <w:rPr>
-                <w:i/>
-                <w:iCs/>
-                <w:lang w:val="es-ES"/>
-              </w:rPr>
-              <w:t>.</w:t>
-            </w:r>
-          </w:p>
-        </w:tc>
-        <w:tc>
-          <w:tcPr>
-            <w:tcW w:w="2215" w:type="dxa"/>
+              <w:t>No hay datos.</w:t>
+            </w:r>
+          </w:p>
+        </w:tc>
+        <w:tc>
+          <w:tcPr>
+            <w:tcW w:w="2547" w:type="dxa"/>
             <w:vAlign w:val="center"/>
             <w:hideMark/>
           </w:tcPr>
@@ -3345,7 +3375,7 @@
         </w:tc>
         <w:tc>
           <w:tcPr>
-            <w:tcW w:w="1788" w:type="dxa"/>
+            <w:tcW w:w="1456" w:type="dxa"/>
             <w:vAlign w:val="center"/>
             <w:hideMark/>
           </w:tcPr>
@@ -3423,19 +3453,7 @@
               <w:rPr>
                 <w:lang w:val="es-ES"/>
               </w:rPr>
-              <w:t>Error “No está comprando nada</w:t>
-            </w:r>
-            <w:r>
-              <w:rPr>
-                <w:lang w:val="es-ES"/>
-              </w:rPr>
-              <w:t>.</w:t>
-            </w:r>
-            <w:r>
-              <w:rPr>
-                <w:lang w:val="es-ES"/>
-              </w:rPr>
-              <w:t>”</w:t>
+              <w:t>Error “No está comprando nada.”</w:t>
             </w:r>
           </w:p>
         </w:tc>
@@ -3552,21 +3570,13 @@
                 <w:iCs/>
                 <w:lang w:val="es-ES"/>
               </w:rPr>
-              <w:t>Campo obligatorio nulo</w:t>
-            </w:r>
-            <w:r>
-              <w:rPr>
-                <w:i/>
-                <w:iCs/>
-                <w:lang w:val="es-ES"/>
-              </w:rPr>
-              <w:t>.</w:t>
-            </w:r>
-          </w:p>
-        </w:tc>
-        <w:tc>
-          <w:tcPr>
-            <w:tcW w:w="2215" w:type="dxa"/>
+              <w:t>Campo obligatorio nulo.</w:t>
+            </w:r>
+          </w:p>
+        </w:tc>
+        <w:tc>
+          <w:tcPr>
+            <w:tcW w:w="2547" w:type="dxa"/>
             <w:vAlign w:val="center"/>
             <w:hideMark/>
           </w:tcPr>
@@ -3581,13 +3591,13 @@
               <w:rPr>
                 <w:lang w:val="es-ES"/>
               </w:rPr>
-              <w:t>4, “Alicates”, “Metal”, 25, “Sergio”</w:t>
-            </w:r>
-          </w:p>
-        </w:tc>
-        <w:tc>
-          <w:tcPr>
-            <w:tcW w:w="1788" w:type="dxa"/>
+              <w:t>2, “Martillo”, “Madera”, 20, “Makita”</w:t>
+            </w:r>
+          </w:p>
+        </w:tc>
+        <w:tc>
+          <w:tcPr>
+            <w:tcW w:w="1456" w:type="dxa"/>
             <w:vAlign w:val="center"/>
             <w:hideMark/>
           </w:tcPr>
@@ -3640,19 +3650,11 @@
                 <w:lang w:val="es-ES"/>
               </w:rPr>
             </w:pPr>
-            <w:proofErr w:type="spellStart"/>
-            <w:r>
-              <w:rPr>
-                <w:lang w:val="es-ES"/>
-              </w:rPr>
-              <w:t>null</w:t>
-            </w:r>
-            <w:proofErr w:type="spellEnd"/>
-            <w:r>
-              <w:rPr>
-                <w:lang w:val="es-ES"/>
-              </w:rPr>
-              <w:t>, “Ortiz”, “Mi Casa”, PayPal, 1, “Útiles”</w:t>
+            <w:r>
+              <w:rPr>
+                <w:lang w:val="es-ES"/>
+              </w:rPr>
+              <w:t>null, “Ortiz”, “Mi Casa”, PayPal, 1, “Útiles”</w:t>
             </w:r>
           </w:p>
         </w:tc>
@@ -3796,7 +3798,7 @@
         </w:tc>
         <w:tc>
           <w:tcPr>
-            <w:tcW w:w="2215" w:type="dxa"/>
+            <w:tcW w:w="2547" w:type="dxa"/>
             <w:vAlign w:val="center"/>
             <w:hideMark/>
           </w:tcPr>
@@ -3811,13 +3813,13 @@
               <w:rPr>
                 <w:lang w:val="es-ES"/>
               </w:rPr>
-              <w:t>4, “Alicates”, “Metal”, 25, “Sergio”</w:t>
-            </w:r>
-          </w:p>
-        </w:tc>
-        <w:tc>
-          <w:tcPr>
-            <w:tcW w:w="1788" w:type="dxa"/>
+              <w:t>2, “Martillo”, “Madera”, 20, “Makita”</w:t>
+            </w:r>
+          </w:p>
+        </w:tc>
+        <w:tc>
+          <w:tcPr>
+            <w:tcW w:w="1456" w:type="dxa"/>
             <w:vAlign w:val="center"/>
             <w:hideMark/>
           </w:tcPr>
@@ -3874,27 +3876,7 @@
               <w:rPr>
                 <w:lang w:val="es-ES"/>
               </w:rPr>
-              <w:t>“Gonzalo”</w:t>
-            </w:r>
-            <w:r>
-              <w:rPr>
-                <w:lang w:val="es-ES"/>
-              </w:rPr>
-              <w:t xml:space="preserve">, </w:t>
-            </w:r>
-            <w:proofErr w:type="spellStart"/>
-            <w:r>
-              <w:rPr>
-                <w:lang w:val="es-ES"/>
-              </w:rPr>
-              <w:t>null</w:t>
-            </w:r>
-            <w:proofErr w:type="spellEnd"/>
-            <w:r>
-              <w:rPr>
-                <w:lang w:val="es-ES"/>
-              </w:rPr>
-              <w:t>, “Mi Casa”, PayPal, 1, “Útiles”</w:t>
+              <w:t>“Gonzalo”, null, “Mi Casa”, PayPal, 1, “Útiles”</w:t>
             </w:r>
           </w:p>
         </w:tc>
@@ -3915,19 +3897,7 @@
               <w:rPr>
                 <w:lang w:val="es-ES"/>
               </w:rPr>
-              <w:t>Error “Introduzca su</w:t>
-            </w:r>
-            <w:r>
-              <w:rPr>
-                <w:lang w:val="es-ES"/>
-              </w:rPr>
-              <w:t>s apellidos</w:t>
-            </w:r>
-            <w:r>
-              <w:rPr>
-                <w:lang w:val="es-ES"/>
-              </w:rPr>
-              <w:t xml:space="preserve">.” </w:t>
+              <w:t xml:space="preserve">Error “Introduzca sus apellidos.” </w:t>
             </w:r>
           </w:p>
         </w:tc>
@@ -4050,7 +4020,7 @@
         </w:tc>
         <w:tc>
           <w:tcPr>
-            <w:tcW w:w="2215" w:type="dxa"/>
+            <w:tcW w:w="2547" w:type="dxa"/>
             <w:vAlign w:val="center"/>
             <w:hideMark/>
           </w:tcPr>
@@ -4065,13 +4035,13 @@
               <w:rPr>
                 <w:lang w:val="es-ES"/>
               </w:rPr>
-              <w:t>4, “Alicates”, “Metal”, 25, “Sergio”</w:t>
-            </w:r>
-          </w:p>
-        </w:tc>
-        <w:tc>
-          <w:tcPr>
-            <w:tcW w:w="1788" w:type="dxa"/>
+              <w:t>2, “Martillo”, “Madera”, 20, “Makita”</w:t>
+            </w:r>
+          </w:p>
+        </w:tc>
+        <w:tc>
+          <w:tcPr>
+            <w:tcW w:w="1456" w:type="dxa"/>
             <w:vAlign w:val="center"/>
             <w:hideMark/>
           </w:tcPr>
@@ -4128,27 +4098,7 @@
               <w:rPr>
                 <w:lang w:val="es-ES"/>
               </w:rPr>
-              <w:t>“Gonzalo”</w:t>
-            </w:r>
-            <w:r>
-              <w:rPr>
-                <w:lang w:val="es-ES"/>
-              </w:rPr>
-              <w:t xml:space="preserve">, “Ortiz”, “Mi Casa”, </w:t>
-            </w:r>
-            <w:proofErr w:type="spellStart"/>
-            <w:r>
-              <w:rPr>
-                <w:lang w:val="es-ES"/>
-              </w:rPr>
-              <w:t>null</w:t>
-            </w:r>
-            <w:proofErr w:type="spellEnd"/>
-            <w:r>
-              <w:rPr>
-                <w:lang w:val="es-ES"/>
-              </w:rPr>
-              <w:t>, 1, “Útiles”</w:t>
+              <w:t>“Gonzalo”, “Ortiz”, “Mi Casa”, null, 1, “Útiles”</w:t>
             </w:r>
           </w:p>
         </w:tc>
@@ -4169,19 +4119,7 @@
               <w:rPr>
                 <w:lang w:val="es-ES"/>
               </w:rPr>
-              <w:t>Error “Introduzca</w:t>
-            </w:r>
-            <w:r>
-              <w:rPr>
-                <w:lang w:val="es-ES"/>
-              </w:rPr>
-              <w:t xml:space="preserve"> un método de pago válido</w:t>
-            </w:r>
-            <w:r>
-              <w:rPr>
-                <w:lang w:val="es-ES"/>
-              </w:rPr>
-              <w:t xml:space="preserve">.” </w:t>
+              <w:t xml:space="preserve">Error “Introduzca un método de pago válido.” </w:t>
             </w:r>
           </w:p>
         </w:tc>
@@ -4284,41 +4222,33 @@
                 <w:iCs/>
                 <w:lang w:val="es-ES"/>
               </w:rPr>
-              <w:t>Compra 0 unidades</w:t>
-            </w:r>
-            <w:r>
-              <w:rPr>
-                <w:i/>
-                <w:iCs/>
-                <w:lang w:val="es-ES"/>
-              </w:rPr>
-              <w:t>.</w:t>
-            </w:r>
-          </w:p>
-        </w:tc>
-        <w:tc>
-          <w:tcPr>
-            <w:tcW w:w="2215" w:type="dxa"/>
-            <w:vAlign w:val="center"/>
-          </w:tcPr>
-          <w:p>
-            <w:pPr>
-              <w:jc w:val="left"/>
-              <w:rPr>
-                <w:lang w:val="es-ES"/>
-              </w:rPr>
-            </w:pPr>
-            <w:r>
-              <w:rPr>
-                <w:lang w:val="es-ES"/>
-              </w:rPr>
-              <w:t>4, “Alicates”, “Metal”, 25, “Sergio”</w:t>
-            </w:r>
-          </w:p>
-        </w:tc>
-        <w:tc>
-          <w:tcPr>
-            <w:tcW w:w="1788" w:type="dxa"/>
+              <w:t>Compra 0 unidades.</w:t>
+            </w:r>
+          </w:p>
+        </w:tc>
+        <w:tc>
+          <w:tcPr>
+            <w:tcW w:w="2547" w:type="dxa"/>
+            <w:vAlign w:val="center"/>
+          </w:tcPr>
+          <w:p>
+            <w:pPr>
+              <w:jc w:val="left"/>
+              <w:rPr>
+                <w:lang w:val="es-ES"/>
+              </w:rPr>
+            </w:pPr>
+            <w:r>
+              <w:rPr>
+                <w:lang w:val="es-ES"/>
+              </w:rPr>
+              <w:t>2, “Martillo”, “Madera”, 20, “Makita”</w:t>
+            </w:r>
+          </w:p>
+        </w:tc>
+        <w:tc>
+          <w:tcPr>
+            <w:tcW w:w="1456" w:type="dxa"/>
             <w:vAlign w:val="center"/>
           </w:tcPr>
           <w:p>
@@ -4372,31 +4302,7 @@
               <w:rPr>
                 <w:lang w:val="es-ES"/>
               </w:rPr>
-              <w:t xml:space="preserve">“Gonzalo”, “Ortiz”, “Mi Casa”, </w:t>
-            </w:r>
-            <w:r>
-              <w:rPr>
-                <w:lang w:val="es-ES"/>
-              </w:rPr>
-              <w:t>PayPal</w:t>
-            </w:r>
-            <w:r>
-              <w:rPr>
-                <w:lang w:val="es-ES"/>
-              </w:rPr>
-              <w:t xml:space="preserve">, </w:t>
-            </w:r>
-            <w:r>
-              <w:rPr>
-                <w:lang w:val="es-ES"/>
-              </w:rPr>
-              <w:t>0</w:t>
-            </w:r>
-            <w:r>
-              <w:rPr>
-                <w:lang w:val="es-ES"/>
-              </w:rPr>
-              <w:t>, “Útiles”</w:t>
+              <w:t>“Gonzalo”, “Ortiz”, “Mi Casa”, PayPal, 0, “Útiles”</w:t>
             </w:r>
           </w:p>
         </w:tc>
@@ -4416,13 +4322,7 @@
               <w:rPr>
                 <w:lang w:val="es-ES"/>
               </w:rPr>
-              <w:t>Error “</w:t>
-            </w:r>
-            <w:r>
-              <w:rPr>
-                <w:lang w:val="es-ES"/>
-              </w:rPr>
-              <w:t>No puede comprar 0 herramientas.”</w:t>
+              <w:t>Error “No puede comprar 0 herramientas.”</w:t>
             </w:r>
           </w:p>
         </w:tc>
@@ -4614,63 +4514,7 @@
         </w:rPr>
       </w:pPr>
       <w:r>
-        <w:t xml:space="preserve">Antes de </w:t>
-      </w:r>
-      <w:proofErr w:type="spellStart"/>
-      <w:r>
-        <w:t>ejecutar</w:t>
-      </w:r>
-      <w:proofErr w:type="spellEnd"/>
-      <w:r>
-        <w:t xml:space="preserve"> </w:t>
-      </w:r>
-      <w:proofErr w:type="spellStart"/>
-      <w:r>
-        <w:t>los</w:t>
-      </w:r>
-      <w:proofErr w:type="spellEnd"/>
-      <w:r>
-        <w:t xml:space="preserve"> </w:t>
-      </w:r>
-      <w:proofErr w:type="spellStart"/>
-      <w:r>
-        <w:t>casos</w:t>
-      </w:r>
-      <w:proofErr w:type="spellEnd"/>
-      <w:r>
-        <w:t xml:space="preserve"> de </w:t>
-      </w:r>
-      <w:proofErr w:type="spellStart"/>
-      <w:r>
-        <w:t>prueba</w:t>
-      </w:r>
-      <w:proofErr w:type="spellEnd"/>
-      <w:r>
-        <w:t xml:space="preserve"> hay </w:t>
-      </w:r>
-      <w:proofErr w:type="spellStart"/>
-      <w:r>
-        <w:t>que</w:t>
-      </w:r>
-      <w:proofErr w:type="spellEnd"/>
-      <w:r>
-        <w:t xml:space="preserve"> </w:t>
-      </w:r>
-      <w:proofErr w:type="spellStart"/>
-      <w:r>
-        <w:t>ejecutar</w:t>
-      </w:r>
-      <w:proofErr w:type="spellEnd"/>
-      <w:r>
-        <w:t xml:space="preserve"> </w:t>
-      </w:r>
-      <w:proofErr w:type="spellStart"/>
-      <w:r>
-        <w:t>los</w:t>
-      </w:r>
-      <w:proofErr w:type="spellEnd"/>
-      <w:r>
-        <w:t xml:space="preserve"> scripts:</w:t>
+        <w:t>Antes de ejecutar los casos de prueba hay que ejecutar los scripts:</w:t>
       </w:r>
     </w:p>
     <w:p>
@@ -4684,19 +4528,11 @@
           <w:lang w:val="es-ES"/>
         </w:rPr>
       </w:pPr>
-      <w:proofErr w:type="spellStart"/>
-      <w:r>
-        <w:rPr>
-          <w:lang w:val="es-ES"/>
-        </w:rPr>
-        <w:t>dbo.Fabricantes.data.sql</w:t>
-      </w:r>
-      <w:proofErr w:type="spellEnd"/>
-      <w:r>
-        <w:rPr>
-          <w:lang w:val="es-ES"/>
-        </w:rPr>
-        <w:t>: Para obtener los fabricantes (nombres).</w:t>
+      <w:r>
+        <w:rPr>
+          <w:lang w:val="es-ES"/>
+        </w:rPr>
+        <w:t>dbo.Fabricantes.data.sql: Para obtener los fabricantes (nombres).</w:t>
       </w:r>
     </w:p>
     <w:p>
@@ -4710,51 +4546,11 @@
           <w:lang w:val="es-ES"/>
         </w:rPr>
       </w:pPr>
-      <w:proofErr w:type="spellStart"/>
-      <w:r>
-        <w:rPr>
-          <w:lang w:val="es-ES"/>
-        </w:rPr>
-        <w:t>dbo.</w:t>
-      </w:r>
-      <w:r>
-        <w:rPr>
-          <w:lang w:val="es-ES"/>
-        </w:rPr>
-        <w:t>Herramientas</w:t>
-      </w:r>
-      <w:r>
-        <w:rPr>
-          <w:lang w:val="es-ES"/>
-        </w:rPr>
-        <w:t>.data.sql</w:t>
-      </w:r>
-      <w:proofErr w:type="spellEnd"/>
-      <w:r>
-        <w:rPr>
-          <w:lang w:val="es-ES"/>
-        </w:rPr>
-        <w:t xml:space="preserve">: </w:t>
-      </w:r>
-      <w:r>
-        <w:rPr>
-          <w:lang w:val="es-ES"/>
-        </w:rPr>
-        <w:t xml:space="preserve">Para obtener las herramientas y sus respectivos atributos, </w:t>
-      </w:r>
-      <w:proofErr w:type="spellStart"/>
-      <w:r>
-        <w:rPr>
-          <w:lang w:val="es-ES"/>
-        </w:rPr>
-        <w:t>incluídos</w:t>
-      </w:r>
-      <w:proofErr w:type="spellEnd"/>
-      <w:r>
-        <w:rPr>
-          <w:lang w:val="es-ES"/>
-        </w:rPr>
-        <w:t xml:space="preserve"> fabricantes (si los tiene).</w:t>
+      <w:r>
+        <w:rPr>
+          <w:lang w:val="es-ES"/>
+        </w:rPr>
+        <w:t>dbo.Herramientas.data.sql: Para obtener las herramientas y sus respectivos atributos, incluídos fabricantes (si los tiene).</w:t>
       </w:r>
     </w:p>
     <w:p>
@@ -4768,37 +4564,11 @@
           <w:lang w:val="es-ES"/>
         </w:rPr>
       </w:pPr>
-      <w:proofErr w:type="spellStart"/>
-      <w:r>
-        <w:rPr>
-          <w:lang w:val="es-ES"/>
-        </w:rPr>
-        <w:t>dbo.</w:t>
-      </w:r>
-      <w:r>
-        <w:rPr>
-          <w:lang w:val="es-ES"/>
-        </w:rPr>
-        <w:t>AspNetUsers</w:t>
-      </w:r>
-      <w:r>
-        <w:rPr>
-          <w:lang w:val="es-ES"/>
-        </w:rPr>
-        <w:t>.data.sql</w:t>
-      </w:r>
-      <w:proofErr w:type="spellEnd"/>
-      <w:r>
-        <w:rPr>
-          <w:lang w:val="es-ES"/>
-        </w:rPr>
-        <w:t xml:space="preserve">: </w:t>
-      </w:r>
-      <w:r>
-        <w:rPr>
-          <w:lang w:val="es-ES"/>
-        </w:rPr>
-        <w:t>Para crear los usuarios y poder introducir su nombre al crear una compra.</w:t>
+      <w:r>
+        <w:rPr>
+          <w:lang w:val="es-ES"/>
+        </w:rPr>
+        <w:t>dbo.AspNetUsers.data.sql: Para crear los usuarios y poder introducir su nombre al crear una compra.</w:t>
       </w:r>
     </w:p>
     <w:p>
@@ -5096,13 +4866,8 @@
       </w:rPr>
     </w:pPr>
     <w:r>
-      <w:t xml:space="preserve">Los </w:t>
+      <w:t>Los Diablillos</w:t>
     </w:r>
-    <w:proofErr w:type="spellStart"/>
-    <w:r>
-      <w:t>Diablillos</w:t>
-    </w:r>
-    <w:proofErr w:type="spellEnd"/>
   </w:p>
   <w:p>
     <w:pPr>
@@ -5184,26 +4949,11 @@
           <w:tcW w:w="6379" w:type="dxa"/>
         </w:tcPr>
         <w:p>
-          <w:r>
-            <w:fldChar w:fldCharType="begin"/>
-          </w:r>
-          <w:r>
-            <w:instrText xml:space="preserve"> TITLE  \* MERGEFORMAT </w:instrText>
-          </w:r>
-          <w:r>
-            <w:fldChar w:fldCharType="separate"/>
-          </w:r>
-          <w:r>
-            <w:t xml:space="preserve">Casos de </w:t>
-          </w:r>
-          <w:proofErr w:type="spellStart"/>
-          <w:r>
-            <w:t>Pruebas</w:t>
-          </w:r>
-          <w:proofErr w:type="spellEnd"/>
-          <w:r>
-            <w:fldChar w:fldCharType="end"/>
-          </w:r>
+          <w:fldSimple w:instr=" TITLE  \* MERGEFORMAT ">
+            <w:r>
+              <w:t>Casos de Pruebas</w:t>
+            </w:r>
+          </w:fldSimple>
         </w:p>
       </w:tc>
       <w:tc>
@@ -5212,15 +4962,7 @@
         </w:tcPr>
         <w:p>
           <w:r>
-            <w:t xml:space="preserve">  </w:t>
-          </w:r>
-          <w:proofErr w:type="spellStart"/>
-          <w:r>
-            <w:t>Fecha</w:t>
-          </w:r>
-          <w:proofErr w:type="spellEnd"/>
-          <w:r>
-            <w:t>:  &lt;</w:t>
+            <w:t xml:space="preserve">  Fecha:  &lt;</w:t>
           </w:r>
           <w:r>
             <w:t>1</w:t>

</xml_diff>

<commit_message>
#232 Errores de la clase compra corregidos.
</commit_message>
<xml_diff>
--- a/test/AppForSEII2526.UIT/CU_ComprarHerramientas/TC-ComprarHerramientas_UIT.docx
+++ b/test/AppForSEII2526.UIT/CU_ComprarHerramientas/TC-ComprarHerramientas_UIT.docx
@@ -2713,67 +2713,7 @@
               <w:rPr>
                 <w:lang w:val="es-ES"/>
               </w:rPr>
-              <w:t xml:space="preserve">Tabla de Herramientas: </w:t>
-            </w:r>
-            <w:r>
-              <w:rPr>
-                <w:lang w:val="es-ES"/>
-              </w:rPr>
-              <w:t>2</w:t>
-            </w:r>
-            <w:r>
-              <w:rPr>
-                <w:lang w:val="es-ES"/>
-              </w:rPr>
-              <w:t>, “</w:t>
-            </w:r>
-            <w:r>
-              <w:rPr>
-                <w:lang w:val="es-ES"/>
-              </w:rPr>
-              <w:t>Martillo</w:t>
-            </w:r>
-            <w:r>
-              <w:rPr>
-                <w:lang w:val="es-ES"/>
-              </w:rPr>
-              <w:t>”, “</w:t>
-            </w:r>
-            <w:r>
-              <w:rPr>
-                <w:lang w:val="es-ES"/>
-              </w:rPr>
-              <w:t>Acero</w:t>
-            </w:r>
-            <w:r>
-              <w:rPr>
-                <w:lang w:val="es-ES"/>
-              </w:rPr>
-              <w:t xml:space="preserve">”, </w:t>
-            </w:r>
-            <w:r>
-              <w:rPr>
-                <w:lang w:val="es-ES"/>
-              </w:rPr>
-              <w:t>20</w:t>
-            </w:r>
-            <w:r>
-              <w:rPr>
-                <w:lang w:val="es-ES"/>
-              </w:rPr>
-              <w:t>, “</w:t>
-            </w:r>
-            <w:r>
-              <w:rPr>
-                <w:lang w:val="es-ES"/>
-              </w:rPr>
-              <w:t>Antonio</w:t>
-            </w:r>
-            <w:r>
-              <w:rPr>
-                <w:lang w:val="es-ES"/>
-              </w:rPr>
-              <w:t>”</w:t>
+              <w:t>Tabla de Herramientas: 2, “Martillo”, “Acero”, 20, “Antonio”</w:t>
             </w:r>
           </w:p>
         </w:tc>
@@ -3310,15 +3250,7 @@
                 <w:iCs/>
                 <w:lang w:val="es-ES"/>
               </w:rPr>
-              <w:t>No hay datos</w:t>
-            </w:r>
-            <w:r>
-              <w:rPr>
-                <w:i/>
-                <w:iCs/>
-                <w:lang w:val="es-ES"/>
-              </w:rPr>
-              <w:t>.</w:t>
+              <w:t>No hay datos.</w:t>
             </w:r>
           </w:p>
         </w:tc>
@@ -3552,15 +3484,7 @@
                 <w:iCs/>
                 <w:lang w:val="es-ES"/>
               </w:rPr>
-              <w:t>Campo obligatorio nulo</w:t>
-            </w:r>
-            <w:r>
-              <w:rPr>
-                <w:i/>
-                <w:iCs/>
-                <w:lang w:val="es-ES"/>
-              </w:rPr>
-              <w:t>.</w:t>
+              <w:t>Campo obligatorio nulo.</w:t>
             </w:r>
           </w:p>
         </w:tc>
@@ -3874,13 +3798,7 @@
               <w:rPr>
                 <w:lang w:val="es-ES"/>
               </w:rPr>
-              <w:t>“Gonzalo”</w:t>
-            </w:r>
-            <w:r>
-              <w:rPr>
-                <w:lang w:val="es-ES"/>
-              </w:rPr>
-              <w:t xml:space="preserve">, </w:t>
+              <w:t xml:space="preserve">“Gonzalo”, </w:t>
             </w:r>
             <w:proofErr w:type="spellStart"/>
             <w:r>
@@ -3915,19 +3833,7 @@
               <w:rPr>
                 <w:lang w:val="es-ES"/>
               </w:rPr>
-              <w:t>Error “Introduzca su</w:t>
-            </w:r>
-            <w:r>
-              <w:rPr>
-                <w:lang w:val="es-ES"/>
-              </w:rPr>
-              <w:t>s apellidos</w:t>
-            </w:r>
-            <w:r>
-              <w:rPr>
-                <w:lang w:val="es-ES"/>
-              </w:rPr>
-              <w:t xml:space="preserve">.” </w:t>
+              <w:t xml:space="preserve">Error “Introduzca sus apellidos.” </w:t>
             </w:r>
           </w:p>
         </w:tc>
@@ -4128,13 +4034,7 @@
               <w:rPr>
                 <w:lang w:val="es-ES"/>
               </w:rPr>
-              <w:t>“Gonzalo”</w:t>
-            </w:r>
-            <w:r>
-              <w:rPr>
-                <w:lang w:val="es-ES"/>
-              </w:rPr>
-              <w:t xml:space="preserve">, “Ortiz”, “Mi Casa”, </w:t>
+              <w:t xml:space="preserve">“Gonzalo”, “Ortiz”, “Mi Casa”, </w:t>
             </w:r>
             <w:proofErr w:type="spellStart"/>
             <w:r>
@@ -4169,19 +4069,7 @@
               <w:rPr>
                 <w:lang w:val="es-ES"/>
               </w:rPr>
-              <w:t>Error “Introduzca</w:t>
-            </w:r>
-            <w:r>
-              <w:rPr>
-                <w:lang w:val="es-ES"/>
-              </w:rPr>
-              <w:t xml:space="preserve"> un método de pago válido</w:t>
-            </w:r>
-            <w:r>
-              <w:rPr>
-                <w:lang w:val="es-ES"/>
-              </w:rPr>
-              <w:t xml:space="preserve">.” </w:t>
+              <w:t xml:space="preserve">Error “Introduzca un método de pago válido.” </w:t>
             </w:r>
           </w:p>
         </w:tc>
@@ -4284,15 +4172,7 @@
                 <w:iCs/>
                 <w:lang w:val="es-ES"/>
               </w:rPr>
-              <w:t>Compra 0 unidades</w:t>
-            </w:r>
-            <w:r>
-              <w:rPr>
-                <w:i/>
-                <w:iCs/>
-                <w:lang w:val="es-ES"/>
-              </w:rPr>
-              <w:t>.</w:t>
+              <w:t>Compra 0 unidades.</w:t>
             </w:r>
           </w:p>
         </w:tc>
@@ -4372,31 +4252,7 @@
               <w:rPr>
                 <w:lang w:val="es-ES"/>
               </w:rPr>
-              <w:t xml:space="preserve">“Gonzalo”, “Ortiz”, “Mi Casa”, </w:t>
-            </w:r>
-            <w:r>
-              <w:rPr>
-                <w:lang w:val="es-ES"/>
-              </w:rPr>
-              <w:t>PayPal</w:t>
-            </w:r>
-            <w:r>
-              <w:rPr>
-                <w:lang w:val="es-ES"/>
-              </w:rPr>
-              <w:t xml:space="preserve">, </w:t>
-            </w:r>
-            <w:r>
-              <w:rPr>
-                <w:lang w:val="es-ES"/>
-              </w:rPr>
-              <w:t>0</w:t>
-            </w:r>
-            <w:r>
-              <w:rPr>
-                <w:lang w:val="es-ES"/>
-              </w:rPr>
-              <w:t>, “Útiles”</w:t>
+              <w:t>“Gonzalo”, “Ortiz”, “Mi Casa”, PayPal, 0, “Útiles”</w:t>
             </w:r>
           </w:p>
         </w:tc>
@@ -4416,13 +4272,7 @@
               <w:rPr>
                 <w:lang w:val="es-ES"/>
               </w:rPr>
-              <w:t>Error “</w:t>
-            </w:r>
-            <w:r>
-              <w:rPr>
-                <w:lang w:val="es-ES"/>
-              </w:rPr>
-              <w:t>No puede comprar 0 herramientas.”</w:t>
+              <w:t>Error “No puede comprar 0 herramientas.”</w:t>
             </w:r>
           </w:p>
         </w:tc>
@@ -4614,63 +4464,10 @@
         </w:rPr>
       </w:pPr>
       <w:r>
-        <w:t xml:space="preserve">Antes de </w:t>
-      </w:r>
-      <w:proofErr w:type="spellStart"/>
-      <w:r>
-        <w:t>ejecutar</w:t>
-      </w:r>
-      <w:proofErr w:type="spellEnd"/>
-      <w:r>
-        <w:t xml:space="preserve"> </w:t>
-      </w:r>
-      <w:proofErr w:type="spellStart"/>
-      <w:r>
-        <w:t>los</w:t>
-      </w:r>
-      <w:proofErr w:type="spellEnd"/>
-      <w:r>
-        <w:t xml:space="preserve"> </w:t>
-      </w:r>
-      <w:proofErr w:type="spellStart"/>
-      <w:r>
-        <w:t>casos</w:t>
-      </w:r>
-      <w:proofErr w:type="spellEnd"/>
-      <w:r>
-        <w:t xml:space="preserve"> de </w:t>
-      </w:r>
-      <w:proofErr w:type="spellStart"/>
-      <w:r>
-        <w:t>prueba</w:t>
-      </w:r>
-      <w:proofErr w:type="spellEnd"/>
-      <w:r>
-        <w:t xml:space="preserve"> hay </w:t>
-      </w:r>
-      <w:proofErr w:type="spellStart"/>
-      <w:r>
-        <w:t>que</w:t>
-      </w:r>
-      <w:proofErr w:type="spellEnd"/>
-      <w:r>
-        <w:t xml:space="preserve"> </w:t>
-      </w:r>
-      <w:proofErr w:type="spellStart"/>
-      <w:r>
-        <w:t>ejecutar</w:t>
-      </w:r>
-      <w:proofErr w:type="spellEnd"/>
-      <w:r>
-        <w:t xml:space="preserve"> </w:t>
-      </w:r>
-      <w:proofErr w:type="spellStart"/>
-      <w:r>
-        <w:t>los</w:t>
-      </w:r>
-      <w:proofErr w:type="spellEnd"/>
-      <w:r>
-        <w:t xml:space="preserve"> scripts:</w:t>
+        <w:rPr>
+          <w:lang w:val="es-ES"/>
+        </w:rPr>
+        <w:t>Antes de ejecutar los casos de prueba hay que ejecutar los scripts:</w:t>
       </w:r>
     </w:p>
     <w:p>
@@ -4715,32 +4512,14 @@
         <w:rPr>
           <w:lang w:val="es-ES"/>
         </w:rPr>
-        <w:t>dbo.</w:t>
-      </w:r>
-      <w:r>
-        <w:rPr>
-          <w:lang w:val="es-ES"/>
-        </w:rPr>
-        <w:t>Herramientas</w:t>
-      </w:r>
-      <w:r>
-        <w:rPr>
-          <w:lang w:val="es-ES"/>
-        </w:rPr>
-        <w:t>.data.sql</w:t>
+        <w:t>dbo.Herramientas.data.sql</w:t>
       </w:r>
       <w:proofErr w:type="spellEnd"/>
       <w:r>
         <w:rPr>
           <w:lang w:val="es-ES"/>
         </w:rPr>
-        <w:t xml:space="preserve">: </w:t>
-      </w:r>
-      <w:r>
-        <w:rPr>
-          <w:lang w:val="es-ES"/>
-        </w:rPr>
-        <w:t xml:space="preserve">Para obtener las herramientas y sus respectivos atributos, </w:t>
+        <w:t xml:space="preserve">: Para obtener las herramientas y sus respectivos atributos, </w:t>
       </w:r>
       <w:proofErr w:type="spellStart"/>
       <w:r>
@@ -4773,32 +4552,14 @@
         <w:rPr>
           <w:lang w:val="es-ES"/>
         </w:rPr>
-        <w:t>dbo.</w:t>
-      </w:r>
-      <w:r>
-        <w:rPr>
-          <w:lang w:val="es-ES"/>
-        </w:rPr>
-        <w:t>AspNetUsers</w:t>
-      </w:r>
-      <w:r>
-        <w:rPr>
-          <w:lang w:val="es-ES"/>
-        </w:rPr>
-        <w:t>.data.sql</w:t>
+        <w:t>dbo.AspNetUsers.data.sql</w:t>
       </w:r>
       <w:proofErr w:type="spellEnd"/>
       <w:r>
         <w:rPr>
           <w:lang w:val="es-ES"/>
         </w:rPr>
-        <w:t xml:space="preserve">: </w:t>
-      </w:r>
-      <w:r>
-        <w:rPr>
-          <w:lang w:val="es-ES"/>
-        </w:rPr>
-        <w:t>Para crear los usuarios y poder introducir su nombre al crear una compra.</w:t>
+        <w:t>: Para crear los usuarios y poder introducir su nombre al crear una compra.</w:t>
       </w:r>
     </w:p>
     <w:p>
@@ -7250,7 +7011,7 @@
       <w:lang w:val="es-ES" w:eastAsia="es-ES"/>
     </w:rPr>
   </w:style>
-  <w:style w:type="character" w:styleId="Textoennegrita">
+  <w:style w:type="character" w:styleId="Fuerte">
     <w:name w:val="Strong"/>
     <w:basedOn w:val="Fuentedeprrafopredeter"/>
     <w:uiPriority w:val="22"/>

</xml_diff>

<commit_message>
#238 Pruebas funcionales de Compra funcionan correctamente. Todo listo para el examen del Martes.
</commit_message>
<xml_diff>
--- a/test/AppForSEII2526.UIT/CU_ComprarHerramientas/TC-ComprarHerramientas_UIT.docx
+++ b/test/AppForSEII2526.UIT/CU_ComprarHerramientas/TC-ComprarHerramientas_UIT.docx
@@ -2229,7 +2229,61 @@
               <w:rPr>
                 <w:lang w:val="es-ES"/>
               </w:rPr>
-              <w:t>4, “Alicates”, “Metal”, 25, “Sergio”</w:t>
+              <w:t>6</w:t>
+            </w:r>
+            <w:r>
+              <w:rPr>
+                <w:lang w:val="es-ES"/>
+              </w:rPr>
+              <w:t>, “</w:t>
+            </w:r>
+            <w:r>
+              <w:rPr>
+                <w:lang w:val="es-ES"/>
+              </w:rPr>
+              <w:t>Sierra</w:t>
+            </w:r>
+            <w:r>
+              <w:rPr>
+                <w:lang w:val="es-ES"/>
+              </w:rPr>
+              <w:t>”, “</w:t>
+            </w:r>
+            <w:r>
+              <w:rPr>
+                <w:lang w:val="es-ES"/>
+              </w:rPr>
+              <w:t>Acero</w:t>
+            </w:r>
+            <w:r>
+              <w:rPr>
+                <w:lang w:val="es-ES"/>
+              </w:rPr>
+              <w:t>”, 2</w:t>
+            </w:r>
+            <w:r>
+              <w:rPr>
+                <w:lang w:val="es-ES"/>
+              </w:rPr>
+              <w:t>0</w:t>
+            </w:r>
+            <w:r>
+              <w:rPr>
+                <w:lang w:val="es-ES"/>
+              </w:rPr>
+              <w:t>, “</w:t>
+            </w:r>
+            <w:r>
+              <w:rPr>
+                <w:lang w:val="es-ES"/>
+              </w:rPr>
+              <w:t>Stanley</w:t>
+            </w:r>
+            <w:r>
+              <w:rPr>
+                <w:lang w:val="es-ES"/>
+              </w:rPr>
+              <w:t>”</w:t>
             </w:r>
           </w:p>
         </w:tc>
@@ -2289,7 +2343,19 @@
               <w:rPr>
                 <w:lang w:val="es-ES"/>
               </w:rPr>
-              <w:t>“Gonzalo”, “Ortiz”, “Mi Casa”, PayPal, 1, “Útiles”</w:t>
+              <w:t>“Gonza”, “Ortiz”, “Mi Casa”, PayPal, 1, “</w:t>
+            </w:r>
+            <w:r>
+              <w:rPr>
+                <w:lang w:val="es-ES"/>
+              </w:rPr>
+              <w:t>Afilada</w:t>
+            </w:r>
+            <w:r>
+              <w:rPr>
+                <w:lang w:val="es-ES"/>
+              </w:rPr>
+              <w:t>”</w:t>
             </w:r>
           </w:p>
         </w:tc>
@@ -2456,7 +2522,7 @@
               <w:rPr>
                 <w:lang w:val="es-ES"/>
               </w:rPr>
-              <w:t>Madera</w:t>
+              <w:t>Acero</w:t>
             </w:r>
           </w:p>
         </w:tc>
@@ -2519,7 +2585,67 @@
               <w:rPr>
                 <w:lang w:val="es-ES"/>
               </w:rPr>
-              <w:t>Tabla de Herramientas: 3, “Astilla”, “Madera”, 7, “Pepe”</w:t>
+              <w:t xml:space="preserve">Tabla de Herramientas: </w:t>
+            </w:r>
+            <w:r>
+              <w:rPr>
+                <w:lang w:val="es-ES"/>
+              </w:rPr>
+              <w:t>6</w:t>
+            </w:r>
+            <w:r>
+              <w:rPr>
+                <w:lang w:val="es-ES"/>
+              </w:rPr>
+              <w:t>, “</w:t>
+            </w:r>
+            <w:r>
+              <w:rPr>
+                <w:lang w:val="es-ES"/>
+              </w:rPr>
+              <w:t>Sierra</w:t>
+            </w:r>
+            <w:r>
+              <w:rPr>
+                <w:lang w:val="es-ES"/>
+              </w:rPr>
+              <w:t>”, “</w:t>
+            </w:r>
+            <w:r>
+              <w:rPr>
+                <w:lang w:val="es-ES"/>
+              </w:rPr>
+              <w:t>Acero</w:t>
+            </w:r>
+            <w:r>
+              <w:rPr>
+                <w:lang w:val="es-ES"/>
+              </w:rPr>
+              <w:t xml:space="preserve">”, </w:t>
+            </w:r>
+            <w:r>
+              <w:rPr>
+                <w:lang w:val="es-ES"/>
+              </w:rPr>
+              <w:t>20</w:t>
+            </w:r>
+            <w:r>
+              <w:rPr>
+                <w:lang w:val="es-ES"/>
+              </w:rPr>
+              <w:t>, “</w:t>
+            </w:r>
+            <w:r>
+              <w:rPr>
+                <w:lang w:val="es-ES"/>
+              </w:rPr>
+              <w:t>Stanley</w:t>
+            </w:r>
+            <w:r>
+              <w:rPr>
+                <w:lang w:val="es-ES"/>
+              </w:rPr>
+              <w:t>”</w:t>
             </w:r>
           </w:p>
         </w:tc>
@@ -2671,7 +2797,7 @@
               <w:rPr>
                 <w:lang w:val="es-ES"/>
               </w:rPr>
-              <w:t>20</w:t>
+              <w:t>5</w:t>
             </w:r>
           </w:p>
         </w:tc>
@@ -2713,7 +2839,67 @@
               <w:rPr>
                 <w:lang w:val="es-ES"/>
               </w:rPr>
-              <w:t>Tabla de Herramientas: 2, “Martillo”, “Acero”, 20, “Antonio”</w:t>
+              <w:t xml:space="preserve">Tabla de Herramientas: </w:t>
+            </w:r>
+            <w:r>
+              <w:rPr>
+                <w:lang w:val="es-ES"/>
+              </w:rPr>
+              <w:t>4</w:t>
+            </w:r>
+            <w:r>
+              <w:rPr>
+                <w:lang w:val="es-ES"/>
+              </w:rPr>
+              <w:t>, “</w:t>
+            </w:r>
+            <w:r>
+              <w:rPr>
+                <w:lang w:val="es-ES"/>
+              </w:rPr>
+              <w:t>Astillas</w:t>
+            </w:r>
+            <w:r>
+              <w:rPr>
+                <w:lang w:val="es-ES"/>
+              </w:rPr>
+              <w:t>”, “</w:t>
+            </w:r>
+            <w:r>
+              <w:rPr>
+                <w:lang w:val="es-ES"/>
+              </w:rPr>
+              <w:t>Madera</w:t>
+            </w:r>
+            <w:r>
+              <w:rPr>
+                <w:lang w:val="es-ES"/>
+              </w:rPr>
+              <w:t xml:space="preserve">”, </w:t>
+            </w:r>
+            <w:r>
+              <w:rPr>
+                <w:lang w:val="es-ES"/>
+              </w:rPr>
+              <w:t>5</w:t>
+            </w:r>
+            <w:r>
+              <w:rPr>
+                <w:lang w:val="es-ES"/>
+              </w:rPr>
+              <w:t>, “</w:t>
+            </w:r>
+            <w:r>
+              <w:rPr>
+                <w:lang w:val="es-ES"/>
+              </w:rPr>
+              <w:t>Milwaukee</w:t>
+            </w:r>
+            <w:r>
+              <w:rPr>
+                <w:lang w:val="es-ES"/>
+              </w:rPr>
+              <w:t>”</w:t>
             </w:r>
           </w:p>
         </w:tc>
@@ -2887,7 +3073,7 @@
               <w:rPr>
                 <w:lang w:val="es-ES"/>
               </w:rPr>
-              <w:t>7</w:t>
+              <w:t>5</w:t>
             </w:r>
           </w:p>
         </w:tc>
@@ -2929,7 +3115,7 @@
               <w:rPr>
                 <w:lang w:val="es-ES"/>
               </w:rPr>
-              <w:t>Tabla de Herramientas: 3, “Astilla”, “Madera”, 7, “Pepe”</w:t>
+              <w:t>Tabla de Herramientas: 4, “Astillas”, “Madera”, 5, “Milwaukee”</w:t>
             </w:r>
           </w:p>
         </w:tc>
@@ -3037,7 +3223,61 @@
               <w:rPr>
                 <w:lang w:val="es-ES"/>
               </w:rPr>
-              <w:t>4, “Alicates”, “Metal”, 25, “Sergio”</w:t>
+              <w:t>6</w:t>
+            </w:r>
+            <w:r>
+              <w:rPr>
+                <w:lang w:val="es-ES"/>
+              </w:rPr>
+              <w:t>, “</w:t>
+            </w:r>
+            <w:r>
+              <w:rPr>
+                <w:lang w:val="es-ES"/>
+              </w:rPr>
+              <w:t>Sierra</w:t>
+            </w:r>
+            <w:r>
+              <w:rPr>
+                <w:lang w:val="es-ES"/>
+              </w:rPr>
+              <w:t>”, “</w:t>
+            </w:r>
+            <w:r>
+              <w:rPr>
+                <w:lang w:val="es-ES"/>
+              </w:rPr>
+              <w:t>Acero</w:t>
+            </w:r>
+            <w:r>
+              <w:rPr>
+                <w:lang w:val="es-ES"/>
+              </w:rPr>
+              <w:t>”, 2</w:t>
+            </w:r>
+            <w:r>
+              <w:rPr>
+                <w:lang w:val="es-ES"/>
+              </w:rPr>
+              <w:t>0</w:t>
+            </w:r>
+            <w:r>
+              <w:rPr>
+                <w:lang w:val="es-ES"/>
+              </w:rPr>
+              <w:t>, “</w:t>
+            </w:r>
+            <w:r>
+              <w:rPr>
+                <w:lang w:val="es-ES"/>
+              </w:rPr>
+              <w:t>Stanley</w:t>
+            </w:r>
+            <w:r>
+              <w:rPr>
+                <w:lang w:val="es-ES"/>
+              </w:rPr>
+              <w:t>”</w:t>
             </w:r>
           </w:p>
         </w:tc>
@@ -3133,7 +3373,51 @@
               <w:rPr>
                 <w:lang w:val="es-ES"/>
               </w:rPr>
-              <w:t>Solo aparecen los Alicates y el precio total cambia.</w:t>
+              <w:t>Solo aparece l</w:t>
+            </w:r>
+            <w:r>
+              <w:rPr>
+                <w:lang w:val="es-ES"/>
+              </w:rPr>
+              <w:t>a</w:t>
+            </w:r>
+            <w:r>
+              <w:rPr>
+                <w:lang w:val="es-ES"/>
+              </w:rPr>
+              <w:t xml:space="preserve"> </w:t>
+            </w:r>
+            <w:proofErr w:type="gramStart"/>
+            <w:r>
+              <w:rPr>
+                <w:lang w:val="es-ES"/>
+              </w:rPr>
+              <w:t xml:space="preserve">Sierra </w:t>
+            </w:r>
+            <w:r>
+              <w:rPr>
+                <w:lang w:val="es-ES"/>
+              </w:rPr>
+              <w:t xml:space="preserve"> y</w:t>
+            </w:r>
+            <w:proofErr w:type="gramEnd"/>
+            <w:r>
+              <w:rPr>
+                <w:lang w:val="es-ES"/>
+              </w:rPr>
+              <w:t xml:space="preserve"> el precio total</w:t>
+            </w:r>
+            <w:r>
+              <w:rPr>
+                <w:lang w:val="es-ES"/>
+              </w:rPr>
+              <w:t xml:space="preserve"> de la compra</w:t>
+            </w:r>
+            <w:r>
+              <w:rPr>
+                <w:lang w:val="es-ES"/>
+              </w:rPr>
+              <w:t xml:space="preserve"> cambia.</w:t>
             </w:r>
           </w:p>
         </w:tc>
@@ -3355,19 +3639,7 @@
               <w:rPr>
                 <w:lang w:val="es-ES"/>
               </w:rPr>
-              <w:t>Error “No está comprando nada</w:t>
-            </w:r>
-            <w:r>
-              <w:rPr>
-                <w:lang w:val="es-ES"/>
-              </w:rPr>
-              <w:t>.</w:t>
-            </w:r>
-            <w:r>
-              <w:rPr>
-                <w:lang w:val="es-ES"/>
-              </w:rPr>
-              <w:t>”</w:t>
+              <w:t>“”</w:t>
             </w:r>
           </w:p>
         </w:tc>
@@ -3505,7 +3777,61 @@
               <w:rPr>
                 <w:lang w:val="es-ES"/>
               </w:rPr>
-              <w:t>4, “Alicates”, “Metal”, 25, “Sergio”</w:t>
+              <w:t>6</w:t>
+            </w:r>
+            <w:r>
+              <w:rPr>
+                <w:lang w:val="es-ES"/>
+              </w:rPr>
+              <w:t>, “</w:t>
+            </w:r>
+            <w:r>
+              <w:rPr>
+                <w:lang w:val="es-ES"/>
+              </w:rPr>
+              <w:t>Sierra</w:t>
+            </w:r>
+            <w:r>
+              <w:rPr>
+                <w:lang w:val="es-ES"/>
+              </w:rPr>
+              <w:t>”, “</w:t>
+            </w:r>
+            <w:r>
+              <w:rPr>
+                <w:lang w:val="es-ES"/>
+              </w:rPr>
+              <w:t>Acero</w:t>
+            </w:r>
+            <w:r>
+              <w:rPr>
+                <w:lang w:val="es-ES"/>
+              </w:rPr>
+              <w:t>”, 2</w:t>
+            </w:r>
+            <w:r>
+              <w:rPr>
+                <w:lang w:val="es-ES"/>
+              </w:rPr>
+              <w:t>0</w:t>
+            </w:r>
+            <w:r>
+              <w:rPr>
+                <w:lang w:val="es-ES"/>
+              </w:rPr>
+              <w:t>, “</w:t>
+            </w:r>
+            <w:r>
+              <w:rPr>
+                <w:lang w:val="es-ES"/>
+              </w:rPr>
+              <w:t>Stanley</w:t>
+            </w:r>
+            <w:r>
+              <w:rPr>
+                <w:lang w:val="es-ES"/>
+              </w:rPr>
+              <w:t>”</w:t>
             </w:r>
           </w:p>
         </w:tc>
@@ -3576,7 +3902,19 @@
               <w:rPr>
                 <w:lang w:val="es-ES"/>
               </w:rPr>
-              <w:t>, “Ortiz”, “Mi Casa”, PayPal, 1, “Útiles”</w:t>
+              <w:t>, “Ortiz”, “Mi Casa”, PayPal, 1, “</w:t>
+            </w:r>
+            <w:r>
+              <w:rPr>
+                <w:lang w:val="es-ES"/>
+              </w:rPr>
+              <w:t>Afilada</w:t>
+            </w:r>
+            <w:r>
+              <w:rPr>
+                <w:lang w:val="es-ES"/>
+              </w:rPr>
+              <w:t>”</w:t>
             </w:r>
           </w:p>
         </w:tc>
@@ -3597,7 +3935,19 @@
               <w:rPr>
                 <w:lang w:val="es-ES"/>
               </w:rPr>
-              <w:t xml:space="preserve">Error “Introduzca su nombre.” </w:t>
+              <w:t>Error “</w:t>
+            </w:r>
+            <w:r>
+              <w:rPr>
+                <w:lang w:val="es-ES"/>
+              </w:rPr>
+              <w:t>El Nombre del cliente es obligatorio.”</w:t>
+            </w:r>
+            <w:r>
+              <w:rPr>
+                <w:lang w:val="es-ES"/>
+              </w:rPr>
+              <w:t xml:space="preserve"> </w:t>
             </w:r>
           </w:p>
         </w:tc>
@@ -3833,7 +4183,19 @@
               <w:rPr>
                 <w:lang w:val="es-ES"/>
               </w:rPr>
-              <w:t xml:space="preserve">Error “Introduzca sus apellidos.” </w:t>
+              <w:t>Error “</w:t>
+            </w:r>
+            <w:r>
+              <w:rPr>
+                <w:lang w:val="es-ES"/>
+              </w:rPr>
+              <w:t>El Apellido del cliente es obligatorio.</w:t>
+            </w:r>
+            <w:r>
+              <w:rPr>
+                <w:lang w:val="es-ES"/>
+              </w:rPr>
+              <w:t xml:space="preserve">” </w:t>
             </w:r>
           </w:p>
         </w:tc>
@@ -4034,7 +4396,7 @@
               <w:rPr>
                 <w:lang w:val="es-ES"/>
               </w:rPr>
-              <w:t xml:space="preserve">“Gonzalo”, “Ortiz”, “Mi Casa”, </w:t>
+              <w:t xml:space="preserve">“Gonzalo”, “Ortiz”, </w:t>
             </w:r>
             <w:proofErr w:type="spellStart"/>
             <w:r>
@@ -4044,6 +4406,18 @@
               <w:t>null</w:t>
             </w:r>
             <w:proofErr w:type="spellEnd"/>
+            <w:r>
+              <w:rPr>
+                <w:lang w:val="es-ES"/>
+              </w:rPr>
+              <w:t xml:space="preserve">, </w:t>
+            </w:r>
+            <w:r>
+              <w:rPr>
+                <w:lang w:val="es-ES"/>
+              </w:rPr>
+              <w:t>PayPal</w:t>
+            </w:r>
             <w:r>
               <w:rPr>
                 <w:lang w:val="es-ES"/>
@@ -4069,7 +4443,19 @@
               <w:rPr>
                 <w:lang w:val="es-ES"/>
               </w:rPr>
-              <w:t xml:space="preserve">Error “Introduzca un método de pago válido.” </w:t>
+              <w:t>Error</w:t>
+            </w:r>
+            <w:r>
+              <w:rPr>
+                <w:lang w:val="es-ES"/>
+              </w:rPr>
+              <w:t xml:space="preserve"> “La dirección de Envío es obligatoria</w:t>
+            </w:r>
+            <w:r>
+              <w:rPr>
+                <w:lang w:val="es-ES"/>
+              </w:rPr>
+              <w:t xml:space="preserve">.” </w:t>
             </w:r>
           </w:p>
         </w:tc>
@@ -4272,7 +4658,13 @@
               <w:rPr>
                 <w:lang w:val="es-ES"/>
               </w:rPr>
-              <w:t>Error “No puede comprar 0 herramientas.”</w:t>
+              <w:t>Error “</w:t>
+            </w:r>
+            <w:r>
+              <w:rPr>
+                <w:lang w:val="es-ES"/>
+              </w:rPr>
+              <w:t>La cantidad debe ser superior a cero.”</w:t>
             </w:r>
           </w:p>
         </w:tc>

</xml_diff>